<commit_message>
SandEE Alpha: housing, floors/doors, bonfire, traps, maps & UI
- Housing rooms + indoor dim; walkable floors and player-facing doors with save/load state
- Bonfire respawn point; mob spawn-clearing on respawn
- Dungeon traps/explosions; merged cave + dungeon minimap
- Sword swing hold-to-repeat and lost-release input-latch fixes
- Furnace Python automation, Color Crafter, tooltips, Lua editor
- New snowy wood/plank/floor/door items + recipes
- Add supabase edge function, website, .vscode; drop old 0.8 release binaries
</commit_message>
<xml_diff>
--- a/docu_thesis/RequiredPapers/EndorsementForm.docx
+++ b/docu_thesis/RequiredPapers/EndorsementForm.docx
@@ -13,7 +13,19 @@
         <w:rPr>
           <w:szCs w:val="24"/>
         </w:rPr>
-        <w:t>ENDORSEMENT FORM FOR PROPOSAL DEFENSE</w:t>
+        <w:t xml:space="preserve">ENDORSEMENT FORM FOR </w:t>
+      </w:r>
+      <w:r>
+        <w:rPr>
+          <w:szCs w:val="24"/>
+        </w:rPr>
+        <w:t>FINAL</w:t>
+      </w:r>
+      <w:r>
+        <w:rPr>
+          <w:szCs w:val="24"/>
+        </w:rPr>
+        <w:t xml:space="preserve"> DEFENSE</w:t>
       </w:r>
     </w:p>
     <w:p>
@@ -58,7 +70,6 @@
         </w:rPr>
         <w:tab/>
       </w:r>
-      <w:proofErr w:type="spellStart"/>
       <w:r>
         <w:rPr>
           <w:szCs w:val="24"/>
@@ -69,14 +80,7 @@
         <w:rPr>
           <w:szCs w:val="24"/>
         </w:rPr>
-        <w:t>dEE</w:t>
-      </w:r>
-      <w:proofErr w:type="spellEnd"/>
-      <w:r>
-        <w:rPr>
-          <w:szCs w:val="24"/>
-        </w:rPr>
-        <w:t>: An Educational 2D Open World Survival</w:t>
+        <w:t>dEE: An Educational 2D Open World Survival</w:t>
       </w:r>
       <w:r>
         <w:rPr>
@@ -196,16 +200,8 @@
         <w:rPr>
           <w:b w:val="0"/>
         </w:rPr>
-        <w:t xml:space="preserve">Jefferson G. </w:t>
-      </w:r>
-      <w:proofErr w:type="spellStart"/>
-      <w:r>
-        <w:rPr>
-          <w:b w:val="0"/>
-        </w:rPr>
-        <w:t>Mamauag</w:t>
-      </w:r>
-      <w:proofErr w:type="spellEnd"/>
+        <w:t>Jefferson G. Mamauag</w:t>
+      </w:r>
     </w:p>
     <w:p>
       <w:pPr>
@@ -570,17 +566,8 @@
           <w:b w:val="0"/>
           <w:szCs w:val="24"/>
         </w:rPr>
-        <w:t xml:space="preserve">Enoch James C. </w:t>
-      </w:r>
-      <w:proofErr w:type="spellStart"/>
-      <w:r>
-        <w:rPr>
-          <w:b w:val="0"/>
-          <w:szCs w:val="24"/>
-        </w:rPr>
-        <w:t>Tayanguna</w:t>
-      </w:r>
-      <w:proofErr w:type="spellEnd"/>
+        <w:t>Enoch James C. Tayanguna</w:t>
+      </w:r>
     </w:p>
     <w:p>
       <w:pPr>
@@ -704,21 +691,12 @@
           <w:szCs w:val="24"/>
         </w:rPr>
       </w:pPr>
-      <w:proofErr w:type="spellStart"/>
-      <w:r>
-        <w:rPr>
-          <w:b w:val="0"/>
-          <w:szCs w:val="24"/>
-        </w:rPr>
-        <w:t>Deffrey</w:t>
-      </w:r>
-      <w:proofErr w:type="spellEnd"/>
-      <w:r>
-        <w:rPr>
-          <w:b w:val="0"/>
-          <w:szCs w:val="24"/>
-        </w:rPr>
-        <w:t xml:space="preserve"> Josh A. Austria</w:t>
+      <w:r>
+        <w:rPr>
+          <w:b w:val="0"/>
+          <w:szCs w:val="24"/>
+        </w:rPr>
+        <w:t>Deffrey Josh A. Austria</w:t>
       </w:r>
     </w:p>
     <w:p>
@@ -775,7 +753,7 @@
         </w:rPr>
       </w:pPr>
       <w:r>
-        <w:t>November 2025</w:t>
+        <w:t>November 2026</w:t>
       </w:r>
     </w:p>
     <w:sectPr>

</xml_diff>

<commit_message>
SandEE 20261017 - 0.9.1
- Polished Housing System.
- Fixed Missions System.
- Fixed UI Scaling Font Issue.
- Added Snowy wood variant.
- Removed Jillian.
- Added more traps in dungeons!
</commit_message>
<xml_diff>
--- a/docu_thesis/RequiredPapers/EndorsementForm.docx
+++ b/docu_thesis/RequiredPapers/EndorsementForm.docx
@@ -70,6 +70,7 @@
         </w:rPr>
         <w:tab/>
       </w:r>
+      <w:proofErr w:type="spellStart"/>
       <w:r>
         <w:rPr>
           <w:szCs w:val="24"/>
@@ -80,7 +81,14 @@
         <w:rPr>
           <w:szCs w:val="24"/>
         </w:rPr>
-        <w:t>dEE: An Educational 2D Open World Survival</w:t>
+        <w:t>dEE</w:t>
+      </w:r>
+      <w:proofErr w:type="spellEnd"/>
+      <w:r>
+        <w:rPr>
+          <w:szCs w:val="24"/>
+        </w:rPr>
+        <w:t>: An Educational 2D Open World Survival</w:t>
       </w:r>
       <w:r>
         <w:rPr>
@@ -200,8 +208,16 @@
         <w:rPr>
           <w:b w:val="0"/>
         </w:rPr>
-        <w:t>Jefferson G. Mamauag</w:t>
-      </w:r>
+        <w:t xml:space="preserve">Jefferson G. </w:t>
+      </w:r>
+      <w:proofErr w:type="spellStart"/>
+      <w:r>
+        <w:rPr>
+          <w:b w:val="0"/>
+        </w:rPr>
+        <w:t>Mamauag</w:t>
+      </w:r>
+      <w:proofErr w:type="spellEnd"/>
     </w:p>
     <w:p>
       <w:pPr>
@@ -566,8 +582,17 @@
           <w:b w:val="0"/>
           <w:szCs w:val="24"/>
         </w:rPr>
-        <w:t>Enoch James C. Tayanguna</w:t>
-      </w:r>
+        <w:t xml:space="preserve">Enoch James C. </w:t>
+      </w:r>
+      <w:proofErr w:type="spellStart"/>
+      <w:r>
+        <w:rPr>
+          <w:b w:val="0"/>
+          <w:szCs w:val="24"/>
+        </w:rPr>
+        <w:t>Tayanguna</w:t>
+      </w:r>
+      <w:proofErr w:type="spellEnd"/>
     </w:p>
     <w:p>
       <w:pPr>
@@ -696,7 +721,7 @@
           <w:b w:val="0"/>
           <w:szCs w:val="24"/>
         </w:rPr>
-        <w:t>Deffrey Josh A. Austria</w:t>
+        <w:t xml:space="preserve">Shiela Marie, </w:t>
       </w:r>
     </w:p>
     <w:p>

</xml_diff>

<commit_message>
- Modified tap to controls. - Added tree wobble. - Require sign in at startup.
</commit_message>
<xml_diff>
--- a/docu_thesis/RequiredPapers/EndorsementForm.docx
+++ b/docu_thesis/RequiredPapers/EndorsementForm.docx
@@ -19,7 +19,7 @@
         <w:rPr>
           <w:szCs w:val="24"/>
         </w:rPr>
-        <w:t>FINAL</w:t>
+        <w:t>ORAL</w:t>
       </w:r>
       <w:r>
         <w:rPr>
@@ -75,63 +75,188 @@
         <w:rPr>
           <w:szCs w:val="24"/>
         </w:rPr>
-        <w:t>San</w:t>
-      </w:r>
-      <w:r>
-        <w:rPr>
-          <w:szCs w:val="24"/>
-        </w:rPr>
-        <w:t>dEE</w:t>
+        <w:t>SandEE</w:t>
       </w:r>
       <w:proofErr w:type="spellEnd"/>
       <w:r>
         <w:rPr>
           <w:szCs w:val="24"/>
         </w:rPr>
-        <w:t>: An Educational 2D Open World Survival</w:t>
-      </w:r>
-      <w:r>
-        <w:rPr>
-          <w:szCs w:val="24"/>
-        </w:rPr>
-        <w:t xml:space="preserve"> </w:t>
-      </w:r>
-      <w:r>
-        <w:rPr>
-          <w:szCs w:val="24"/>
-        </w:rPr>
-        <w:tab/>
-      </w:r>
-      <w:r>
-        <w:rPr>
-          <w:szCs w:val="24"/>
-        </w:rPr>
-        <w:tab/>
-      </w:r>
-      <w:r>
-        <w:rPr>
-          <w:szCs w:val="24"/>
-        </w:rPr>
-        <w:tab/>
-      </w:r>
-      <w:r>
-        <w:rPr>
-          <w:szCs w:val="24"/>
-        </w:rPr>
-        <w:tab/>
-      </w:r>
-      <w:r>
-        <w:rPr>
-          <w:szCs w:val="24"/>
-        </w:rPr>
-        <w:tab/>
-      </w:r>
-      <w:r>
-        <w:rPr>
-          <w:szCs w:val="24"/>
-        </w:rPr>
-        <w:tab/>
-        <w:t>Crafting Game for Lua and Python</w:t>
+        <w:t xml:space="preserve">: AN EDUCATIONAL MULTI-PLATFORM </w:t>
+      </w:r>
+      <w:r>
+        <w:rPr>
+          <w:szCs w:val="24"/>
+        </w:rPr>
+        <w:tab/>
+      </w:r>
+      <w:r>
+        <w:rPr>
+          <w:szCs w:val="24"/>
+        </w:rPr>
+        <w:tab/>
+      </w:r>
+      <w:r>
+        <w:rPr>
+          <w:szCs w:val="24"/>
+        </w:rPr>
+        <w:tab/>
+      </w:r>
+      <w:r>
+        <w:rPr>
+          <w:szCs w:val="24"/>
+        </w:rPr>
+        <w:tab/>
+      </w:r>
+      <w:r>
+        <w:rPr>
+          <w:szCs w:val="24"/>
+        </w:rPr>
+        <w:tab/>
+      </w:r>
+      <w:r>
+        <w:rPr>
+          <w:szCs w:val="24"/>
+        </w:rPr>
+        <w:tab/>
+      </w:r>
+      <w:r>
+        <w:rPr>
+          <w:szCs w:val="24"/>
+        </w:rPr>
+        <w:t xml:space="preserve">2D OPEN WORLD SURVIVAL CRAFTING GAME </w:t>
+      </w:r>
+      <w:r>
+        <w:rPr>
+          <w:szCs w:val="24"/>
+        </w:rPr>
+        <w:tab/>
+      </w:r>
+      <w:r>
+        <w:rPr>
+          <w:szCs w:val="24"/>
+        </w:rPr>
+        <w:tab/>
+      </w:r>
+      <w:r>
+        <w:rPr>
+          <w:szCs w:val="24"/>
+        </w:rPr>
+        <w:tab/>
+      </w:r>
+      <w:r>
+        <w:rPr>
+          <w:szCs w:val="24"/>
+        </w:rPr>
+        <w:tab/>
+      </w:r>
+      <w:r>
+        <w:rPr>
+          <w:szCs w:val="24"/>
+        </w:rPr>
+        <w:tab/>
+      </w:r>
+      <w:r>
+        <w:rPr>
+          <w:szCs w:val="24"/>
+        </w:rPr>
+        <w:tab/>
+      </w:r>
+      <w:r>
+        <w:rPr>
+          <w:szCs w:val="24"/>
+        </w:rPr>
+        <w:t xml:space="preserve">FOR LUA AND PYTHON FOR ICT AND STEM </w:t>
+      </w:r>
+      <w:r>
+        <w:rPr>
+          <w:szCs w:val="24"/>
+        </w:rPr>
+        <w:tab/>
+      </w:r>
+      <w:r>
+        <w:rPr>
+          <w:szCs w:val="24"/>
+        </w:rPr>
+        <w:tab/>
+      </w:r>
+      <w:r>
+        <w:rPr>
+          <w:szCs w:val="24"/>
+        </w:rPr>
+        <w:tab/>
+      </w:r>
+      <w:r>
+        <w:rPr>
+          <w:szCs w:val="24"/>
+        </w:rPr>
+        <w:tab/>
+      </w:r>
+      <w:r>
+        <w:rPr>
+          <w:szCs w:val="24"/>
+        </w:rPr>
+        <w:tab/>
+      </w:r>
+      <w:r>
+        <w:rPr>
+          <w:szCs w:val="24"/>
+        </w:rPr>
+        <w:tab/>
+      </w:r>
+      <w:r>
+        <w:rPr>
+          <w:szCs w:val="24"/>
+        </w:rPr>
+        <w:t xml:space="preserve">STUDENTS OF YVERDON DE PESTALLOZI </w:t>
+      </w:r>
+      <w:r>
+        <w:rPr>
+          <w:szCs w:val="24"/>
+        </w:rPr>
+        <w:tab/>
+      </w:r>
+      <w:r>
+        <w:rPr>
+          <w:szCs w:val="24"/>
+        </w:rPr>
+        <w:tab/>
+      </w:r>
+      <w:r>
+        <w:rPr>
+          <w:szCs w:val="24"/>
+        </w:rPr>
+        <w:tab/>
+      </w:r>
+      <w:r>
+        <w:rPr>
+          <w:szCs w:val="24"/>
+        </w:rPr>
+        <w:tab/>
+      </w:r>
+      <w:r>
+        <w:rPr>
+          <w:szCs w:val="24"/>
+        </w:rPr>
+        <w:tab/>
+      </w:r>
+      <w:r>
+        <w:rPr>
+          <w:szCs w:val="24"/>
+        </w:rPr>
+        <w:tab/>
+      </w:r>
+      <w:r>
+        <w:rPr>
+          <w:szCs w:val="24"/>
+        </w:rPr>
+        <w:tab/>
+      </w:r>
+      <w:r>
+        <w:rPr>
+          <w:szCs w:val="24"/>
+        </w:rPr>
+        <w:t>SCHOOL INC.</w:t>
       </w:r>
     </w:p>
     <w:p>
@@ -273,21 +398,6 @@
     </w:p>
     <w:p>
       <w:pPr>
-        <w:pStyle w:val="Proposal1"/>
-        <w:numPr>
-          <w:ilvl w:val="0"/>
-          <w:numId w:val="0"/>
-        </w:numPr>
-        <w:spacing w:before="0" w:after="0" w:line="240" w:lineRule="auto"/>
-        <w:ind w:left="3240" w:firstLine="360"/>
-        <w:rPr>
-          <w:b/>
-          <w:szCs w:val="24"/>
-        </w:rPr>
-      </w:pPr>
-    </w:p>
-    <w:p>
-      <w:pPr>
         <w:jc w:val="both"/>
         <w:rPr>
           <w:b w:val="0"/>
@@ -350,21 +460,6 @@
         </w:rPr>
         <w:t>has been examined and is recommended for Proposal Defense.</w:t>
       </w:r>
-    </w:p>
-    <w:p>
-      <w:pPr>
-        <w:widowControl w:val="0"/>
-        <w:overflowPunct w:val="0"/>
-        <w:autoSpaceDE w:val="0"/>
-        <w:autoSpaceDN w:val="0"/>
-        <w:adjustRightInd w:val="0"/>
-        <w:spacing w:line="241" w:lineRule="auto"/>
-        <w:ind w:right="60"/>
-        <w:rPr>
-          <w:b w:val="0"/>
-          <w:szCs w:val="24"/>
-        </w:rPr>
-      </w:pPr>
     </w:p>
     <w:p>
       <w:pPr>
@@ -564,6 +659,22 @@
           <w:szCs w:val="24"/>
         </w:rPr>
       </w:pPr>
+      <w:r>
+        <w:rPr>
+          <w:b w:val="0"/>
+          <w:szCs w:val="24"/>
+        </w:rPr>
+        <w:t xml:space="preserve">Enoch James C. </w:t>
+      </w:r>
+      <w:proofErr w:type="spellStart"/>
+      <w:r>
+        <w:rPr>
+          <w:b w:val="0"/>
+          <w:szCs w:val="24"/>
+        </w:rPr>
+        <w:t>Tayanguna</w:t>
+      </w:r>
+      <w:proofErr w:type="spellEnd"/>
     </w:p>
     <w:p>
       <w:pPr>
@@ -579,20 +690,10 @@
       </w:pPr>
       <w:r>
         <w:rPr>
-          <w:b w:val="0"/>
-          <w:szCs w:val="24"/>
-        </w:rPr>
-        <w:t xml:space="preserve">Enoch James C. </w:t>
-      </w:r>
-      <w:proofErr w:type="spellStart"/>
-      <w:r>
-        <w:rPr>
-          <w:b w:val="0"/>
-          <w:szCs w:val="24"/>
-        </w:rPr>
-        <w:t>Tayanguna</w:t>
-      </w:r>
-      <w:proofErr w:type="spellEnd"/>
+          <w:szCs w:val="24"/>
+        </w:rPr>
+        <w:t>Thesis Coordinator</w:t>
+      </w:r>
     </w:p>
     <w:p>
       <w:pPr>
@@ -602,16 +703,9 @@
         <w:adjustRightInd w:val="0"/>
         <w:ind w:right="60"/>
         <w:rPr>
-          <w:b w:val="0"/>
-          <w:szCs w:val="24"/>
-        </w:rPr>
-      </w:pPr>
-      <w:r>
-        <w:rPr>
-          <w:szCs w:val="24"/>
-        </w:rPr>
-        <w:t>Thesis Coordinator</w:t>
-      </w:r>
+          <w:szCs w:val="24"/>
+        </w:rPr>
+      </w:pPr>
     </w:p>
     <w:p>
       <w:pPr>
@@ -645,9 +739,16 @@
         <w:adjustRightInd w:val="0"/>
         <w:ind w:right="60"/>
         <w:rPr>
-          <w:szCs w:val="24"/>
-        </w:rPr>
-      </w:pPr>
+          <w:b w:val="0"/>
+          <w:szCs w:val="24"/>
+        </w:rPr>
+      </w:pPr>
+      <w:r>
+        <w:rPr>
+          <w:szCs w:val="24"/>
+        </w:rPr>
+        <w:t>NOTED BY:</w:t>
+      </w:r>
     </w:p>
     <w:p>
       <w:pPr>
@@ -657,16 +758,9 @@
         <w:adjustRightInd w:val="0"/>
         <w:ind w:right="60"/>
         <w:rPr>
-          <w:b w:val="0"/>
-          <w:szCs w:val="24"/>
-        </w:rPr>
-      </w:pPr>
-      <w:r>
-        <w:rPr>
-          <w:szCs w:val="24"/>
-        </w:rPr>
-        <w:t>NOTED BY:</w:t>
-      </w:r>
+          <w:szCs w:val="24"/>
+        </w:rPr>
+      </w:pPr>
     </w:p>
     <w:p>
       <w:pPr>
@@ -700,9 +794,33 @@
         <w:adjustRightInd w:val="0"/>
         <w:ind w:right="60"/>
         <w:rPr>
-          <w:szCs w:val="24"/>
-        </w:rPr>
-      </w:pPr>
+          <w:b w:val="0"/>
+          <w:szCs w:val="24"/>
+        </w:rPr>
+      </w:pPr>
+      <w:r>
+        <w:rPr>
+          <w:b w:val="0"/>
+          <w:szCs w:val="24"/>
+        </w:rPr>
+        <w:t>Shiela Marie</w:t>
+      </w:r>
+      <w:r>
+        <w:rPr>
+          <w:b w:val="0"/>
+          <w:szCs w:val="24"/>
+        </w:rPr>
+        <w:t xml:space="preserve"> B. </w:t>
+      </w:r>
+      <w:proofErr w:type="spellStart"/>
+      <w:r>
+        <w:rPr>
+          <w:b w:val="0"/>
+          <w:szCs w:val="24"/>
+        </w:rPr>
+        <w:t>Llesol</w:t>
+      </w:r>
+      <w:proofErr w:type="spellEnd"/>
     </w:p>
     <w:p>
       <w:pPr>
@@ -712,46 +830,27 @@
         <w:adjustRightInd w:val="0"/>
         <w:ind w:right="60"/>
         <w:rPr>
-          <w:b w:val="0"/>
-          <w:szCs w:val="24"/>
-        </w:rPr>
-      </w:pPr>
-      <w:r>
-        <w:rPr>
-          <w:b w:val="0"/>
-          <w:szCs w:val="24"/>
-        </w:rPr>
-        <w:t xml:space="preserve">Shiela Marie, </w:t>
+          <w:szCs w:val="24"/>
+        </w:rPr>
+      </w:pPr>
+      <w:r>
+        <w:rPr>
+          <w:szCs w:val="24"/>
+        </w:rPr>
+        <w:t>Program Head</w:t>
       </w:r>
     </w:p>
     <w:p>
       <w:pPr>
         <w:widowControl w:val="0"/>
-        <w:autoSpaceDE w:val="0"/>
-        <w:autoSpaceDN w:val="0"/>
-        <w:adjustRightInd w:val="0"/>
-        <w:ind w:right="60"/>
-        <w:rPr>
-          <w:szCs w:val="24"/>
-        </w:rPr>
-      </w:pPr>
-      <w:r>
-        <w:rPr>
-          <w:szCs w:val="24"/>
-        </w:rPr>
-        <w:t>Program Head</w:t>
-      </w:r>
-    </w:p>
-    <w:p>
-      <w:pPr>
-        <w:widowControl w:val="0"/>
+        <w:tabs>
+          <w:tab w:val="left" w:pos="5160"/>
+        </w:tabs>
         <w:autoSpaceDE w:val="0"/>
         <w:autoSpaceDN w:val="0"/>
         <w:adjustRightInd w:val="0"/>
         <w:ind w:right="58"/>
         <w:rPr>
-          <w:b w:val="0"/>
-          <w:color w:val="C00000"/>
           <w:szCs w:val="24"/>
         </w:rPr>
       </w:pPr>

</xml_diff>